<commit_message>
Corrige les incohérences entre le cahier des charges et le backlog
Le cahier des charges (.docx) mentionnait "6 epics / 21 tickets" alors que
le backlog (.md) en compte désormais 7 epics / 31 tickets (l'utilisateur a
ajouté les epics 6 "Qualité, sécurité & mise en production" et 7 "Frontend
transverse & design system" — HBA-024 à HBA-031). Ajout des sections et
tableaux correspondants dans le .docx, avec la même mise en forme que les
epics existants. Correction également de la liste des rôles RBAC dans le
tableau de stack technique (le rôle "visitor" manquait).

Co-Authored-By: Claude Sonnet 5 <noreply@anthropic.com>
</commit_message>
<xml_diff>
--- a/HBA_Connect_Cahier_des_charges.docx
+++ b/HBA_Connect_Cahier_des_charges.docx
@@ -2444,7 +2444,7 @@
                 <w:sz w:val="18"/>
                 <w:szCs w:val="18"/>
               </w:rPr>
-              <w:t xml:space="preserve">JWT + gestion de rôles (RBAC) : prospect, apprenant, formateur, admin</w:t>
+              <w:t>JWT + gestion de rôles (RBAC) : visitor, prospect, apprenant, formateur, admin</w:t>
             </w:r>
           </w:p>
         </w:tc>
@@ -3378,7 +3378,7 @@
           <w:sz w:val="21"/>
           <w:szCs w:val="21"/>
         </w:rPr>
-        <w:t xml:space="preserve">Le backlog est organisé en 6 epics couvrant l'ensemble du périmètre fonctionnel, pour un total de 21 tickets prêts à être repris en développement (format compatible Claude Code).</w:t>
+        <w:t>Le backlog est organisé en 7 epics couvrant l'ensemble du périmètre fonctionnel, pour un total de 31 tickets prêts à être repris en développement (format compatible Claude Code).</w:t>
       </w:r>
     </w:p>
     <w:p>
@@ -4444,6 +4444,232 @@
           </w:p>
         </w:tc>
       </w:tr>
+      <w:tr>
+        <w:tc>
+          <w:tcPr>
+            <w:tcW w:type="dxa" w:w="1000"/>
+          </w:tcPr>
+          <w:p>
+            <w:r>
+              <w:rPr>
+                <w:b/>
+                <w:color w:val="1F8A8C"/>
+                <w:sz w:val="18"/>
+              </w:rPr>
+              <w:t>HBA-022</w:t>
+            </w:r>
+          </w:p>
+        </w:tc>
+        <w:tc>
+          <w:tcPr>
+            <w:tcW w:type="dxa" w:w="2400"/>
+          </w:tcPr>
+          <w:p>
+            <w:r>
+              <w:rPr>
+                <w:b/>
+                <w:color w:val="1F8A8C"/>
+                <w:sz w:val="18"/>
+              </w:rPr>
+              <w:t>Page "Nos formateurs"</w:t>
+            </w:r>
+          </w:p>
+        </w:tc>
+        <w:tc>
+          <w:tcPr>
+            <w:tcW w:type="dxa" w:w="3200"/>
+          </w:tcPr>
+          <w:p>
+            <w:r>
+              <w:rPr>
+                <w:sz w:val="18"/>
+              </w:rPr>
+              <w:t>Page publique présentant l'équipe de formateurs du centre, avec pour chacun sa carrière et ses spécialités, afin de rassurer les prospects sur la qualité pédagogique.</w:t>
+            </w:r>
+          </w:p>
+        </w:tc>
+        <w:tc>
+          <w:tcPr>
+            <w:tcW w:type="dxa" w:w="3600"/>
+          </w:tcPr>
+          <w:p>
+            <w:pPr>
+              <w:pStyle w:val="ListParagraph"/>
+              <w:numPr>
+                <w:ilvl w:val="0"/>
+                <w:numId w:val="3"/>
+              </w:numPr>
+              <w:spacing w:after="20"/>
+            </w:pPr>
+            <w:r>
+              <w:rPr>
+                <w:sz w:val="17"/>
+              </w:rPr>
+              <w:t>Chaque formateur a une fiche complète (bio, parcours, formations dispensées)</w:t>
+            </w:r>
+          </w:p>
+          <w:p>
+            <w:pPr>
+              <w:pStyle w:val="ListParagraph"/>
+              <w:numPr>
+                <w:ilvl w:val="0"/>
+                <w:numId w:val="3"/>
+              </w:numPr>
+              <w:spacing w:after="20"/>
+            </w:pPr>
+            <w:r>
+              <w:rPr>
+                <w:sz w:val="17"/>
+              </w:rPr>
+              <w:t>La fiche formateur et la fiche formation sont liées dans les deux sens</w:t>
+            </w:r>
+          </w:p>
+          <w:p>
+            <w:pPr>
+              <w:pStyle w:val="ListParagraph"/>
+              <w:numPr>
+                <w:ilvl w:val="0"/>
+                <w:numId w:val="3"/>
+              </w:numPr>
+              <w:spacing w:after="20"/>
+            </w:pPr>
+            <w:r>
+              <w:rPr>
+                <w:sz w:val="17"/>
+              </w:rPr>
+              <w:t>Un administrateur peut modifier une fiche formateur depuis le backoffice sans intervention technique</w:t>
+            </w:r>
+          </w:p>
+        </w:tc>
+        <w:tc>
+          <w:tcPr>
+            <w:tcW w:type="dxa" w:w="1200"/>
+          </w:tcPr>
+          <w:p>
+            <w:r>
+              <w:rPr>
+                <w:b/>
+                <w:color w:val="1F8A8C"/>
+                <w:sz w:val="18"/>
+              </w:rPr>
+              <w:t>Moyenne</w:t>
+            </w:r>
+          </w:p>
+        </w:tc>
+      </w:tr>
+      <w:tr>
+        <w:tc>
+          <w:tcPr>
+            <w:tcW w:type="dxa" w:w="1000"/>
+          </w:tcPr>
+          <w:p>
+            <w:r>
+              <w:rPr>
+                <w:b/>
+                <w:color w:val="1F8A8C"/>
+                <w:sz w:val="18"/>
+              </w:rPr>
+              <w:t>HBA-023</w:t>
+            </w:r>
+          </w:p>
+        </w:tc>
+        <w:tc>
+          <w:tcPr>
+            <w:tcW w:type="dxa" w:w="2400"/>
+          </w:tcPr>
+          <w:p>
+            <w:r>
+              <w:rPr>
+                <w:b/>
+                <w:color w:val="1F8A8C"/>
+                <w:sz w:val="18"/>
+              </w:rPr>
+              <w:t>Page "Nos réalisations" (exploits du centre)</w:t>
+            </w:r>
+          </w:p>
+        </w:tc>
+        <w:tc>
+          <w:tcPr>
+            <w:tcW w:type="dxa" w:w="3200"/>
+          </w:tcPr>
+          <w:p>
+            <w:r>
+              <w:rPr>
+                <w:sz w:val="18"/>
+              </w:rPr>
+              <w:t>Page publique valorisant la crédibilité du centre : chiffres clés, projets/concours gagnés, partenariats, moments marquants — en complément de l'espace preuves sociales déjà prévu (HBA-005) qui reste centré sur les projets élèves au niveau des fiches formation.</w:t>
+            </w:r>
+          </w:p>
+        </w:tc>
+        <w:tc>
+          <w:tcPr>
+            <w:tcW w:type="dxa" w:w="3600"/>
+          </w:tcPr>
+          <w:p>
+            <w:pPr>
+              <w:pStyle w:val="ListParagraph"/>
+              <w:numPr>
+                <w:ilvl w:val="0"/>
+                <w:numId w:val="3"/>
+              </w:numPr>
+              <w:spacing w:after="20"/>
+            </w:pPr>
+            <w:r>
+              <w:rPr>
+                <w:sz w:val="17"/>
+              </w:rPr>
+              <w:t>Les chiffres clés affichés sont configurables depuis le backoffice, jamais codés en dur</w:t>
+            </w:r>
+          </w:p>
+          <w:p>
+            <w:pPr>
+              <w:pStyle w:val="ListParagraph"/>
+              <w:numPr>
+                <w:ilvl w:val="0"/>
+                <w:numId w:val="3"/>
+              </w:numPr>
+              <w:spacing w:after="20"/>
+            </w:pPr>
+            <w:r>
+              <w:rPr>
+                <w:sz w:val="17"/>
+              </w:rPr>
+              <w:t>Au moins une réalisation "mise en avant" apparaît sur la page d'accueil</w:t>
+            </w:r>
+          </w:p>
+          <w:p>
+            <w:pPr>
+              <w:pStyle w:val="ListParagraph"/>
+              <w:numPr>
+                <w:ilvl w:val="0"/>
+                <w:numId w:val="3"/>
+              </w:numPr>
+              <w:spacing w:after="20"/>
+            </w:pPr>
+            <w:r>
+              <w:rPr>
+                <w:sz w:val="17"/>
+              </w:rPr>
+              <w:t>La page reste crédible : chaque chiffre ou concours affiché doit pouvoir être justifié (pas de statistique inventée)</w:t>
+            </w:r>
+          </w:p>
+        </w:tc>
+        <w:tc>
+          <w:tcPr>
+            <w:tcW w:type="dxa" w:w="1200"/>
+          </w:tcPr>
+          <w:p>
+            <w:r>
+              <w:rPr>
+                <w:b/>
+                <w:color w:val="1F8A8C"/>
+                <w:sz w:val="18"/>
+              </w:rPr>
+              <w:t>Moyenne</w:t>
+            </w:r>
+          </w:p>
+        </w:tc>
+      </w:tr>
     </w:tbl>
     <w:p>
       <w:pPr>
@@ -8030,6 +8256,1138 @@
         <w:spacing w:after="200"/>
       </w:pPr>
     </w:p>
+    <w:p>
+      <w:pPr>
+        <w:pStyle w:val="Heading3"/>
+        <w:spacing w:after="120" w:before="240"/>
+      </w:pPr>
+      <w:r>
+        <w:rPr>
+          <w:b/>
+          <w:bCs/>
+          <w:color w:val="1B2A4A"/>
+          <w:sz w:val="22"/>
+          <w:szCs w:val="22"/>
+        </w:rPr>
+        <w:t>Epic 6 — Qualité, sécurité &amp; mise en production</w:t>
+      </w:r>
+    </w:p>
+    <w:p>
+      <w:pPr>
+        <w:spacing w:after="160" w:line="300"/>
+      </w:pPr>
+      <w:r>
+        <w:rPr>
+          <w:color w:val="222222"/>
+          <w:sz w:val="21"/>
+          <w:szCs w:val="21"/>
+        </w:rPr>
+        <w:t>Cet epic couvre la conformité légale (RGPD, consentement mineur), la qualité logicielle (tests automatisés) et la mise en production sécurisée et supervisée de la plateforme.</w:t>
+      </w:r>
+    </w:p>
+    <w:tbl>
+      <w:tblPr>
+        <w:tblW w:type="dxa" w:w="11400"/>
+        <w:tblBorders>
+          <w:top w:val="single" w:color="auto" w:sz="4"/>
+          <w:left w:val="single" w:color="auto" w:sz="4"/>
+          <w:bottom w:val="single" w:color="auto" w:sz="4"/>
+          <w:right w:val="single" w:color="auto" w:sz="4"/>
+          <w:insideH w:val="single" w:color="auto" w:sz="4"/>
+          <w:insideV w:val="single" w:color="auto" w:sz="4"/>
+        </w:tblBorders>
+      </w:tblPr>
+      <w:tblGrid>
+        <w:gridCol w:w="1000"/>
+        <w:gridCol w:w="2400"/>
+        <w:gridCol w:w="3200"/>
+        <w:gridCol w:w="3600"/>
+        <w:gridCol w:w="1200"/>
+      </w:tblGrid>
+      <w:tr>
+        <w:trPr>
+          <w:tblHeader/>
+        </w:trPr>
+        <w:tc>
+          <w:tcPr>
+            <w:tcW w:type="dxa" w:w="1000"/>
+            <w:shd w:fill="1B2A4A" w:val="clear"/>
+            <w:tcMar>
+              <w:top w:type="dxa" w:w="80"/>
+              <w:left w:type="dxa" w:w="100"/>
+              <w:bottom w:type="dxa" w:w="80"/>
+              <w:right w:type="dxa" w:w="100"/>
+            </w:tcMar>
+            <w:vAlign w:val="top"/>
+          </w:tcPr>
+          <w:p>
+            <w:pPr>
+              <w:spacing w:after="40"/>
+            </w:pPr>
+            <w:r>
+              <w:rPr>
+                <w:b/>
+                <w:bCs/>
+                <w:color w:val="FFFFFF"/>
+                <w:sz w:val="18"/>
+                <w:szCs w:val="18"/>
+              </w:rPr>
+              <w:t xml:space="preserve">ID</w:t>
+            </w:r>
+          </w:p>
+        </w:tc>
+        <w:tc>
+          <w:tcPr>
+            <w:tcW w:type="dxa" w:w="2400"/>
+            <w:shd w:fill="1B2A4A" w:val="clear"/>
+            <w:tcMar>
+              <w:top w:type="dxa" w:w="80"/>
+              <w:left w:type="dxa" w:w="100"/>
+              <w:bottom w:type="dxa" w:w="80"/>
+              <w:right w:type="dxa" w:w="100"/>
+            </w:tcMar>
+            <w:vAlign w:val="top"/>
+          </w:tcPr>
+          <w:p>
+            <w:pPr>
+              <w:spacing w:after="40"/>
+            </w:pPr>
+            <w:r>
+              <w:rPr>
+                <w:b/>
+                <w:bCs/>
+                <w:color w:val="FFFFFF"/>
+                <w:sz w:val="18"/>
+                <w:szCs w:val="18"/>
+              </w:rPr>
+              <w:t xml:space="preserve">Titre</w:t>
+            </w:r>
+          </w:p>
+        </w:tc>
+        <w:tc>
+          <w:tcPr>
+            <w:tcW w:type="dxa" w:w="3200"/>
+            <w:shd w:fill="1B2A4A" w:val="clear"/>
+            <w:tcMar>
+              <w:top w:type="dxa" w:w="80"/>
+              <w:left w:type="dxa" w:w="100"/>
+              <w:bottom w:type="dxa" w:w="80"/>
+              <w:right w:type="dxa" w:w="100"/>
+            </w:tcMar>
+            <w:vAlign w:val="top"/>
+          </w:tcPr>
+          <w:p>
+            <w:pPr>
+              <w:spacing w:after="40"/>
+            </w:pPr>
+            <w:r>
+              <w:rPr>
+                <w:b/>
+                <w:bCs/>
+                <w:color w:val="FFFFFF"/>
+                <w:sz w:val="18"/>
+                <w:szCs w:val="18"/>
+              </w:rPr>
+              <w:t xml:space="preserve">Description</w:t>
+            </w:r>
+          </w:p>
+        </w:tc>
+        <w:tc>
+          <w:tcPr>
+            <w:tcW w:type="dxa" w:w="3600"/>
+            <w:shd w:fill="1B2A4A" w:val="clear"/>
+            <w:tcMar>
+              <w:top w:type="dxa" w:w="80"/>
+              <w:left w:type="dxa" w:w="100"/>
+              <w:bottom w:type="dxa" w:w="80"/>
+              <w:right w:type="dxa" w:w="100"/>
+            </w:tcMar>
+            <w:vAlign w:val="top"/>
+          </w:tcPr>
+          <w:p>
+            <w:pPr>
+              <w:spacing w:after="40"/>
+            </w:pPr>
+            <w:r>
+              <w:rPr>
+                <w:b/>
+                <w:bCs/>
+                <w:color w:val="FFFFFF"/>
+                <w:sz w:val="18"/>
+                <w:szCs w:val="18"/>
+              </w:rPr>
+              <w:t xml:space="preserve">Critères d'acceptation</w:t>
+            </w:r>
+          </w:p>
+        </w:tc>
+        <w:tc>
+          <w:tcPr>
+            <w:tcW w:type="dxa" w:w="1200"/>
+            <w:shd w:fill="1B2A4A" w:val="clear"/>
+            <w:tcMar>
+              <w:top w:type="dxa" w:w="80"/>
+              <w:left w:type="dxa" w:w="100"/>
+              <w:bottom w:type="dxa" w:w="80"/>
+              <w:right w:type="dxa" w:w="100"/>
+            </w:tcMar>
+            <w:vAlign w:val="top"/>
+          </w:tcPr>
+          <w:p>
+            <w:pPr>
+              <w:spacing w:after="40"/>
+            </w:pPr>
+            <w:r>
+              <w:rPr>
+                <w:b/>
+                <w:bCs/>
+                <w:color w:val="FFFFFF"/>
+                <w:sz w:val="18"/>
+                <w:szCs w:val="18"/>
+              </w:rPr>
+              <w:t xml:space="preserve">Priorité</w:t>
+            </w:r>
+          </w:p>
+        </w:tc>
+      </w:tr>
+      <w:tr>
+        <w:tc>
+          <w:tcPr>
+            <w:tcW w:type="dxa" w:w="1000"/>
+          </w:tcPr>
+          <w:p>
+            <w:r>
+              <w:rPr>
+                <w:b/>
+                <w:color w:val="1F8A8C"/>
+                <w:sz w:val="18"/>
+              </w:rPr>
+              <w:t>HBA-024</w:t>
+            </w:r>
+          </w:p>
+        </w:tc>
+        <w:tc>
+          <w:tcPr>
+            <w:tcW w:type="dxa" w:w="2400"/>
+          </w:tcPr>
+          <w:p>
+            <w:r>
+              <w:rPr>
+                <w:b/>
+                <w:color w:val="1F8A8C"/>
+                <w:sz w:val="18"/>
+              </w:rPr>
+              <w:t>Pages légales &amp; conformité RGPD</w:t>
+            </w:r>
+          </w:p>
+        </w:tc>
+        <w:tc>
+          <w:tcPr>
+            <w:tcW w:type="dxa" w:w="3200"/>
+          </w:tcPr>
+          <w:p>
+            <w:r>
+              <w:rPr>
+                <w:sz w:val="18"/>
+              </w:rPr>
+              <w:t>Mise en place des pages légales obligatoires et du mécanisme de consentement, avec attention particulière aux données de mineurs (formations enfants/ados).</w:t>
+            </w:r>
+          </w:p>
+        </w:tc>
+        <w:tc>
+          <w:tcPr>
+            <w:tcW w:type="dxa" w:w="3600"/>
+          </w:tcPr>
+          <w:p>
+            <w:pPr>
+              <w:pStyle w:val="ListParagraph"/>
+              <w:numPr>
+                <w:ilvl w:val="0"/>
+                <w:numId w:val="3"/>
+              </w:numPr>
+              <w:spacing w:after="20"/>
+            </w:pPr>
+            <w:r>
+              <w:rPr>
+                <w:sz w:val="17"/>
+              </w:rPr>
+              <w:t>Aucune donnée personnelle n'est collectée avant consentement explicite</w:t>
+            </w:r>
+          </w:p>
+          <w:p>
+            <w:pPr>
+              <w:pStyle w:val="ListParagraph"/>
+              <w:numPr>
+                <w:ilvl w:val="0"/>
+                <w:numId w:val="3"/>
+              </w:numPr>
+              <w:spacing w:after="20"/>
+            </w:pPr>
+            <w:r>
+              <w:rPr>
+                <w:sz w:val="17"/>
+              </w:rPr>
+              <w:t>La préinscription d'un mineur exige le consentement parental avant validation</w:t>
+            </w:r>
+          </w:p>
+        </w:tc>
+        <w:tc>
+          <w:tcPr>
+            <w:tcW w:type="dxa" w:w="1200"/>
+          </w:tcPr>
+          <w:p>
+            <w:r>
+              <w:rPr>
+                <w:b/>
+                <w:color w:val="1F8A8C"/>
+                <w:sz w:val="18"/>
+              </w:rPr>
+              <w:t>Haute</w:t>
+            </w:r>
+          </w:p>
+        </w:tc>
+      </w:tr>
+      <w:tr>
+        <w:tc>
+          <w:tcPr>
+            <w:tcW w:type="dxa" w:w="1000"/>
+          </w:tcPr>
+          <w:p>
+            <w:r>
+              <w:rPr>
+                <w:b/>
+                <w:color w:val="1F8A8C"/>
+                <w:sz w:val="18"/>
+              </w:rPr>
+              <w:t>HBA-025</w:t>
+            </w:r>
+          </w:p>
+        </w:tc>
+        <w:tc>
+          <w:tcPr>
+            <w:tcW w:type="dxa" w:w="2400"/>
+          </w:tcPr>
+          <w:p>
+            <w:r>
+              <w:rPr>
+                <w:b/>
+                <w:color w:val="1F8A8C"/>
+                <w:sz w:val="18"/>
+              </w:rPr>
+              <w:t>Suite de tests automatisés</w:t>
+            </w:r>
+          </w:p>
+        </w:tc>
+        <w:tc>
+          <w:tcPr>
+            <w:tcW w:type="dxa" w:w="3200"/>
+          </w:tcPr>
+          <w:p>
+            <w:r>
+              <w:rPr>
+                <w:sz w:val="18"/>
+              </w:rPr>
+              <w:t>Couverture de tests backend et frontend sur les parcours critiques.</w:t>
+            </w:r>
+          </w:p>
+        </w:tc>
+        <w:tc>
+          <w:tcPr>
+            <w:tcW w:type="dxa" w:w="3600"/>
+          </w:tcPr>
+          <w:p>
+            <w:pPr>
+              <w:pStyle w:val="ListParagraph"/>
+              <w:numPr>
+                <w:ilvl w:val="0"/>
+                <w:numId w:val="3"/>
+              </w:numPr>
+              <w:spacing w:after="20"/>
+            </w:pPr>
+            <w:r>
+              <w:rPr>
+                <w:sz w:val="17"/>
+              </w:rPr>
+              <w:t>Les parcours de conversion (préinscription, chatbot, simulateur) sont couverts par au moins un test automatisé chacun</w:t>
+            </w:r>
+          </w:p>
+          <w:p>
+            <w:pPr>
+              <w:pStyle w:val="ListParagraph"/>
+              <w:numPr>
+                <w:ilvl w:val="0"/>
+                <w:numId w:val="3"/>
+              </w:numPr>
+              <w:spacing w:after="20"/>
+            </w:pPr>
+            <w:r>
+              <w:rPr>
+                <w:sz w:val="17"/>
+              </w:rPr>
+              <w:t>Le pipeline CI/CD bloque un déploiement si un test échoue</w:t>
+            </w:r>
+          </w:p>
+        </w:tc>
+        <w:tc>
+          <w:tcPr>
+            <w:tcW w:type="dxa" w:w="1200"/>
+          </w:tcPr>
+          <w:p>
+            <w:r>
+              <w:rPr>
+                <w:b/>
+                <w:color w:val="1F8A8C"/>
+                <w:sz w:val="18"/>
+              </w:rPr>
+              <w:t>Haute</w:t>
+            </w:r>
+          </w:p>
+        </w:tc>
+      </w:tr>
+      <w:tr>
+        <w:tc>
+          <w:tcPr>
+            <w:tcW w:type="dxa" w:w="1000"/>
+          </w:tcPr>
+          <w:p>
+            <w:r>
+              <w:rPr>
+                <w:b/>
+                <w:color w:val="1F8A8C"/>
+                <w:sz w:val="18"/>
+              </w:rPr>
+              <w:t>HBA-026</w:t>
+            </w:r>
+          </w:p>
+        </w:tc>
+        <w:tc>
+          <w:tcPr>
+            <w:tcW w:type="dxa" w:w="2400"/>
+          </w:tcPr>
+          <w:p>
+            <w:r>
+              <w:rPr>
+                <w:b/>
+                <w:color w:val="1F8A8C"/>
+                <w:sz w:val="18"/>
+              </w:rPr>
+              <w:t>Mise en production, monitoring &amp; sauvegardes</w:t>
+            </w:r>
+          </w:p>
+        </w:tc>
+        <w:tc>
+          <w:tcPr>
+            <w:tcW w:type="dxa" w:w="3200"/>
+          </w:tcPr>
+          <w:p>
+            <w:r>
+              <w:rPr>
+                <w:sz w:val="18"/>
+              </w:rPr>
+              <w:t>Passage en production sécurisé et supervisé.</w:t>
+            </w:r>
+          </w:p>
+        </w:tc>
+        <w:tc>
+          <w:tcPr>
+            <w:tcW w:type="dxa" w:w="3600"/>
+          </w:tcPr>
+          <w:p>
+            <w:pPr>
+              <w:pStyle w:val="ListParagraph"/>
+              <w:numPr>
+                <w:ilvl w:val="0"/>
+                <w:numId w:val="3"/>
+              </w:numPr>
+              <w:spacing w:after="20"/>
+            </w:pPr>
+            <w:r>
+              <w:rPr>
+                <w:sz w:val="17"/>
+              </w:rPr>
+              <w:t>Une alerte est déclenchée en cas d'indisponibilité de la plateforme</w:t>
+            </w:r>
+          </w:p>
+          <w:p>
+            <w:pPr>
+              <w:pStyle w:val="ListParagraph"/>
+              <w:numPr>
+                <w:ilvl w:val="0"/>
+                <w:numId w:val="3"/>
+              </w:numPr>
+              <w:spacing w:after="20"/>
+            </w:pPr>
+            <w:r>
+              <w:rPr>
+                <w:sz w:val="17"/>
+              </w:rPr>
+              <w:t>Une restauration de sauvegarde a été testée avec succès avant le lancement officiel</w:t>
+            </w:r>
+          </w:p>
+        </w:tc>
+        <w:tc>
+          <w:tcPr>
+            <w:tcW w:type="dxa" w:w="1200"/>
+          </w:tcPr>
+          <w:p>
+            <w:r>
+              <w:rPr>
+                <w:b/>
+                <w:color w:val="1F8A8C"/>
+                <w:sz w:val="18"/>
+              </w:rPr>
+              <w:t>Haute</w:t>
+            </w:r>
+          </w:p>
+        </w:tc>
+      </w:tr>
+      <w:tr>
+        <w:tc>
+          <w:tcPr>
+            <w:tcW w:type="dxa" w:w="1000"/>
+          </w:tcPr>
+          <w:p>
+            <w:r>
+              <w:rPr>
+                <w:b/>
+                <w:color w:val="1F8A8C"/>
+                <w:sz w:val="18"/>
+              </w:rPr>
+              <w:t>HBA-027</w:t>
+            </w:r>
+          </w:p>
+        </w:tc>
+        <w:tc>
+          <w:tcPr>
+            <w:tcW w:type="dxa" w:w="2400"/>
+          </w:tcPr>
+          <w:p>
+            <w:r>
+              <w:rPr>
+                <w:b/>
+                <w:color w:val="1F8A8C"/>
+                <w:sz w:val="18"/>
+              </w:rPr>
+              <w:t>Formation de l'équipe HBA au backoffice</w:t>
+            </w:r>
+          </w:p>
+        </w:tc>
+        <w:tc>
+          <w:tcPr>
+            <w:tcW w:type="dxa" w:w="3200"/>
+          </w:tcPr>
+          <w:p>
+            <w:r>
+              <w:rPr>
+                <w:sz w:val="18"/>
+              </w:rPr>
+              <w:t>Session de formation pratique de l'équipe administrative du centre à l'utilisation du backoffice.</w:t>
+            </w:r>
+          </w:p>
+        </w:tc>
+        <w:tc>
+          <w:tcPr>
+            <w:tcW w:type="dxa" w:w="3600"/>
+          </w:tcPr>
+          <w:p>
+            <w:pPr>
+              <w:pStyle w:val="ListParagraph"/>
+              <w:numPr>
+                <w:ilvl w:val="0"/>
+                <w:numId w:val="3"/>
+              </w:numPr>
+              <w:spacing w:after="20"/>
+            </w:pPr>
+            <w:r>
+              <w:rPr>
+                <w:sz w:val="17"/>
+              </w:rPr>
+              <w:t>L'équipe HBA est capable de publier une formation et un témoignage en autonomie, sans assistance, à l'issue de la session</w:t>
+            </w:r>
+          </w:p>
+        </w:tc>
+        <w:tc>
+          <w:tcPr>
+            <w:tcW w:type="dxa" w:w="1200"/>
+          </w:tcPr>
+          <w:p>
+            <w:r>
+              <w:rPr>
+                <w:b/>
+                <w:color w:val="1F8A8C"/>
+                <w:sz w:val="18"/>
+              </w:rPr>
+              <w:t>Moyenne</w:t>
+            </w:r>
+          </w:p>
+        </w:tc>
+      </w:tr>
+    </w:tbl>
+    <w:p>
+      <w:pPr>
+        <w:pStyle w:val="Heading3"/>
+        <w:spacing w:after="120" w:before="240"/>
+      </w:pPr>
+      <w:r>
+        <w:rPr>
+          <w:b/>
+          <w:bCs/>
+          <w:color w:val="1B2A4A"/>
+          <w:sz w:val="22"/>
+          <w:szCs w:val="22"/>
+        </w:rPr>
+        <w:t>Epic 7 — Frontend transverse &amp; design system</w:t>
+      </w:r>
+    </w:p>
+    <w:p>
+      <w:pPr>
+        <w:spacing w:after="160" w:line="300"/>
+      </w:pPr>
+      <w:r>
+        <w:rPr>
+          <w:color w:val="222222"/>
+          <w:sz w:val="21"/>
+          <w:szCs w:val="21"/>
+        </w:rPr>
+        <w:t>Cet epic couvre la cohérence visuelle, l'accessibilité et les performances de l'interface sur l'ensemble des modules de la plateforme.</w:t>
+      </w:r>
+    </w:p>
+    <w:tbl>
+      <w:tblPr>
+        <w:tblW w:type="dxa" w:w="11400"/>
+        <w:tblBorders>
+          <w:top w:val="single" w:color="auto" w:sz="4"/>
+          <w:left w:val="single" w:color="auto" w:sz="4"/>
+          <w:bottom w:val="single" w:color="auto" w:sz="4"/>
+          <w:right w:val="single" w:color="auto" w:sz="4"/>
+          <w:insideH w:val="single" w:color="auto" w:sz="4"/>
+          <w:insideV w:val="single" w:color="auto" w:sz="4"/>
+        </w:tblBorders>
+      </w:tblPr>
+      <w:tblGrid>
+        <w:gridCol w:w="1000"/>
+        <w:gridCol w:w="2400"/>
+        <w:gridCol w:w="3200"/>
+        <w:gridCol w:w="3600"/>
+        <w:gridCol w:w="1200"/>
+      </w:tblGrid>
+      <w:tr>
+        <w:trPr>
+          <w:tblHeader/>
+        </w:trPr>
+        <w:tc>
+          <w:tcPr>
+            <w:tcW w:type="dxa" w:w="1000"/>
+            <w:shd w:fill="1B2A4A" w:val="clear"/>
+            <w:tcMar>
+              <w:top w:type="dxa" w:w="80"/>
+              <w:left w:type="dxa" w:w="100"/>
+              <w:bottom w:type="dxa" w:w="80"/>
+              <w:right w:type="dxa" w:w="100"/>
+            </w:tcMar>
+            <w:vAlign w:val="top"/>
+          </w:tcPr>
+          <w:p>
+            <w:pPr>
+              <w:spacing w:after="40"/>
+            </w:pPr>
+            <w:r>
+              <w:rPr>
+                <w:b/>
+                <w:bCs/>
+                <w:color w:val="FFFFFF"/>
+                <w:sz w:val="18"/>
+                <w:szCs w:val="18"/>
+              </w:rPr>
+              <w:t xml:space="preserve">ID</w:t>
+            </w:r>
+          </w:p>
+        </w:tc>
+        <w:tc>
+          <w:tcPr>
+            <w:tcW w:type="dxa" w:w="2400"/>
+            <w:shd w:fill="1B2A4A" w:val="clear"/>
+            <w:tcMar>
+              <w:top w:type="dxa" w:w="80"/>
+              <w:left w:type="dxa" w:w="100"/>
+              <w:bottom w:type="dxa" w:w="80"/>
+              <w:right w:type="dxa" w:w="100"/>
+            </w:tcMar>
+            <w:vAlign w:val="top"/>
+          </w:tcPr>
+          <w:p>
+            <w:pPr>
+              <w:spacing w:after="40"/>
+            </w:pPr>
+            <w:r>
+              <w:rPr>
+                <w:b/>
+                <w:bCs/>
+                <w:color w:val="FFFFFF"/>
+                <w:sz w:val="18"/>
+                <w:szCs w:val="18"/>
+              </w:rPr>
+              <w:t xml:space="preserve">Titre</w:t>
+            </w:r>
+          </w:p>
+        </w:tc>
+        <w:tc>
+          <w:tcPr>
+            <w:tcW w:type="dxa" w:w="3200"/>
+            <w:shd w:fill="1B2A4A" w:val="clear"/>
+            <w:tcMar>
+              <w:top w:type="dxa" w:w="80"/>
+              <w:left w:type="dxa" w:w="100"/>
+              <w:bottom w:type="dxa" w:w="80"/>
+              <w:right w:type="dxa" w:w="100"/>
+            </w:tcMar>
+            <w:vAlign w:val="top"/>
+          </w:tcPr>
+          <w:p>
+            <w:pPr>
+              <w:spacing w:after="40"/>
+            </w:pPr>
+            <w:r>
+              <w:rPr>
+                <w:b/>
+                <w:bCs/>
+                <w:color w:val="FFFFFF"/>
+                <w:sz w:val="18"/>
+                <w:szCs w:val="18"/>
+              </w:rPr>
+              <w:t xml:space="preserve">Description</w:t>
+            </w:r>
+          </w:p>
+        </w:tc>
+        <w:tc>
+          <w:tcPr>
+            <w:tcW w:type="dxa" w:w="3600"/>
+            <w:shd w:fill="1B2A4A" w:val="clear"/>
+            <w:tcMar>
+              <w:top w:type="dxa" w:w="80"/>
+              <w:left w:type="dxa" w:w="100"/>
+              <w:bottom w:type="dxa" w:w="80"/>
+              <w:right w:type="dxa" w:w="100"/>
+            </w:tcMar>
+            <w:vAlign w:val="top"/>
+          </w:tcPr>
+          <w:p>
+            <w:pPr>
+              <w:spacing w:after="40"/>
+            </w:pPr>
+            <w:r>
+              <w:rPr>
+                <w:b/>
+                <w:bCs/>
+                <w:color w:val="FFFFFF"/>
+                <w:sz w:val="18"/>
+                <w:szCs w:val="18"/>
+              </w:rPr>
+              <w:t xml:space="preserve">Critères d'acceptation</w:t>
+            </w:r>
+          </w:p>
+        </w:tc>
+        <w:tc>
+          <w:tcPr>
+            <w:tcW w:type="dxa" w:w="1200"/>
+            <w:shd w:fill="1B2A4A" w:val="clear"/>
+            <w:tcMar>
+              <w:top w:type="dxa" w:w="80"/>
+              <w:left w:type="dxa" w:w="100"/>
+              <w:bottom w:type="dxa" w:w="80"/>
+              <w:right w:type="dxa" w:w="100"/>
+            </w:tcMar>
+            <w:vAlign w:val="top"/>
+          </w:tcPr>
+          <w:p>
+            <w:pPr>
+              <w:spacing w:after="40"/>
+            </w:pPr>
+            <w:r>
+              <w:rPr>
+                <w:b/>
+                <w:bCs/>
+                <w:color w:val="FFFFFF"/>
+                <w:sz w:val="18"/>
+                <w:szCs w:val="18"/>
+              </w:rPr>
+              <w:t xml:space="preserve">Priorité</w:t>
+            </w:r>
+          </w:p>
+        </w:tc>
+      </w:tr>
+      <w:tr>
+        <w:tc>
+          <w:tcPr>
+            <w:tcW w:type="dxa" w:w="1000"/>
+          </w:tcPr>
+          <w:p>
+            <w:r>
+              <w:rPr>
+                <w:b/>
+                <w:color w:val="1F8A8C"/>
+                <w:sz w:val="18"/>
+              </w:rPr>
+              <w:t>HBA-028</w:t>
+            </w:r>
+          </w:p>
+        </w:tc>
+        <w:tc>
+          <w:tcPr>
+            <w:tcW w:type="dxa" w:w="2400"/>
+          </w:tcPr>
+          <w:p>
+            <w:r>
+              <w:rPr>
+                <w:b/>
+                <w:color w:val="1F8A8C"/>
+                <w:sz w:val="18"/>
+              </w:rPr>
+              <w:t>SEO technique &amp; performance</w:t>
+            </w:r>
+          </w:p>
+        </w:tc>
+        <w:tc>
+          <w:tcPr>
+            <w:tcW w:type="dxa" w:w="3200"/>
+          </w:tcPr>
+          <w:p>
+            <w:r>
+              <w:rPr>
+                <w:sz w:val="18"/>
+              </w:rPr>
+              <w:t>Optimisation du référencement naturel et des performances de chargement.</w:t>
+            </w:r>
+          </w:p>
+        </w:tc>
+        <w:tc>
+          <w:tcPr>
+            <w:tcW w:type="dxa" w:w="3600"/>
+          </w:tcPr>
+          <w:p>
+            <w:pPr>
+              <w:pStyle w:val="ListParagraph"/>
+              <w:numPr>
+                <w:ilvl w:val="0"/>
+                <w:numId w:val="3"/>
+              </w:numPr>
+              <w:spacing w:after="20"/>
+            </w:pPr>
+            <w:r>
+              <w:rPr>
+                <w:sz w:val="17"/>
+              </w:rPr>
+              <w:t>Score Lighthouse performance ≥ 80 sur mobile pour la page d'accueil et le catalogue</w:t>
+            </w:r>
+          </w:p>
+          <w:p>
+            <w:pPr>
+              <w:pStyle w:val="ListParagraph"/>
+              <w:numPr>
+                <w:ilvl w:val="0"/>
+                <w:numId w:val="3"/>
+              </w:numPr>
+              <w:spacing w:after="20"/>
+            </w:pPr>
+            <w:r>
+              <w:rPr>
+                <w:sz w:val="17"/>
+              </w:rPr>
+              <w:t>Sitemap accessible et à jour automatiquement à chaque nouvelle formation publiée</w:t>
+            </w:r>
+          </w:p>
+        </w:tc>
+        <w:tc>
+          <w:tcPr>
+            <w:tcW w:type="dxa" w:w="1200"/>
+          </w:tcPr>
+          <w:p>
+            <w:r>
+              <w:rPr>
+                <w:b/>
+                <w:color w:val="1F8A8C"/>
+                <w:sz w:val="18"/>
+              </w:rPr>
+              <w:t>Moyenne</w:t>
+            </w:r>
+          </w:p>
+        </w:tc>
+      </w:tr>
+      <w:tr>
+        <w:tc>
+          <w:tcPr>
+            <w:tcW w:type="dxa" w:w="1000"/>
+          </w:tcPr>
+          <w:p>
+            <w:r>
+              <w:rPr>
+                <w:b/>
+                <w:color w:val="1F8A8C"/>
+                <w:sz w:val="18"/>
+              </w:rPr>
+              <w:t>HBA-029</w:t>
+            </w:r>
+          </w:p>
+        </w:tc>
+        <w:tc>
+          <w:tcPr>
+            <w:tcW w:type="dxa" w:w="2400"/>
+          </w:tcPr>
+          <w:p>
+            <w:r>
+              <w:rPr>
+                <w:b/>
+                <w:color w:val="1F8A8C"/>
+                <w:sz w:val="18"/>
+              </w:rPr>
+              <w:t>Design system HBA (composants UI réutilisables)</w:t>
+            </w:r>
+          </w:p>
+        </w:tc>
+        <w:tc>
+          <w:tcPr>
+            <w:tcW w:type="dxa" w:w="3200"/>
+          </w:tcPr>
+          <w:p>
+            <w:r>
+              <w:rPr>
+                <w:sz w:val="18"/>
+              </w:rPr>
+              <w:t>Bibliothèque de composants UI partagés pour garantir une cohérence visuelle sur toute la plateforme, alignée avec la charte graphique du centre HBA.</w:t>
+            </w:r>
+          </w:p>
+        </w:tc>
+        <w:tc>
+          <w:tcPr>
+            <w:tcW w:type="dxa" w:w="3600"/>
+          </w:tcPr>
+          <w:p>
+            <w:pPr>
+              <w:pStyle w:val="ListParagraph"/>
+              <w:numPr>
+                <w:ilvl w:val="0"/>
+                <w:numId w:val="3"/>
+              </w:numPr>
+              <w:spacing w:after="20"/>
+            </w:pPr>
+            <w:r>
+              <w:rPr>
+                <w:sz w:val="17"/>
+              </w:rPr>
+              <w:t>Tous les nouveaux composants développés dans les epics suivants réutilisent cette bibliothèque plutôt que du style ad hoc</w:t>
+            </w:r>
+          </w:p>
+          <w:p>
+            <w:pPr>
+              <w:pStyle w:val="ListParagraph"/>
+              <w:numPr>
+                <w:ilvl w:val="0"/>
+                <w:numId w:val="3"/>
+              </w:numPr>
+              <w:spacing w:after="20"/>
+            </w:pPr>
+            <w:r>
+              <w:rPr>
+                <w:sz w:val="17"/>
+              </w:rPr>
+              <w:t>Les couleurs et typographies sont centralisées (aucune couleur codée en dur dispersée dans le code)</w:t>
+            </w:r>
+          </w:p>
+        </w:tc>
+        <w:tc>
+          <w:tcPr>
+            <w:tcW w:type="dxa" w:w="1200"/>
+          </w:tcPr>
+          <w:p>
+            <w:r>
+              <w:rPr>
+                <w:b/>
+                <w:color w:val="1F8A8C"/>
+                <w:sz w:val="18"/>
+              </w:rPr>
+              <w:t>Haute</w:t>
+            </w:r>
+          </w:p>
+        </w:tc>
+      </w:tr>
+      <w:tr>
+        <w:tc>
+          <w:tcPr>
+            <w:tcW w:type="dxa" w:w="1000"/>
+          </w:tcPr>
+          <w:p>
+            <w:r>
+              <w:rPr>
+                <w:b/>
+                <w:color w:val="1F8A8C"/>
+                <w:sz w:val="18"/>
+              </w:rPr>
+              <w:t>HBA-030</w:t>
+            </w:r>
+          </w:p>
+        </w:tc>
+        <w:tc>
+          <w:tcPr>
+            <w:tcW w:type="dxa" w:w="2400"/>
+          </w:tcPr>
+          <w:p>
+            <w:r>
+              <w:rPr>
+                <w:b/>
+                <w:color w:val="1F8A8C"/>
+                <w:sz w:val="18"/>
+              </w:rPr>
+              <w:t>Responsive, accessibilité &amp; tests cross-device</w:t>
+            </w:r>
+          </w:p>
+        </w:tc>
+        <w:tc>
+          <w:tcPr>
+            <w:tcW w:type="dxa" w:w="3200"/>
+          </w:tcPr>
+          <w:p>
+            <w:r>
+              <w:rPr>
+                <w:sz w:val="18"/>
+              </w:rPr>
+              <w:t>Vérification et correction de l'expérience sur mobile, tablette et desktop, ainsi que des standards d'accessibilité de base.</w:t>
+            </w:r>
+          </w:p>
+        </w:tc>
+        <w:tc>
+          <w:tcPr>
+            <w:tcW w:type="dxa" w:w="3600"/>
+          </w:tcPr>
+          <w:p>
+            <w:pPr>
+              <w:pStyle w:val="ListParagraph"/>
+              <w:numPr>
+                <w:ilvl w:val="0"/>
+                <w:numId w:val="3"/>
+              </w:numPr>
+              <w:spacing w:after="20"/>
+            </w:pPr>
+            <w:r>
+              <w:rPr>
+                <w:sz w:val="17"/>
+              </w:rPr>
+              <w:t>Aucune page publique ne casse visuellement sur les tailles d'écran courantes (mobile/tablette/desktop)</w:t>
+            </w:r>
+          </w:p>
+          <w:p>
+            <w:pPr>
+              <w:pStyle w:val="ListParagraph"/>
+              <w:numPr>
+                <w:ilvl w:val="0"/>
+                <w:numId w:val="3"/>
+              </w:numPr>
+              <w:spacing w:after="20"/>
+            </w:pPr>
+            <w:r>
+              <w:rPr>
+                <w:sz w:val="17"/>
+              </w:rPr>
+              <w:t>Les images ont des attributs alt, les formulaires sont navigables au clavier</w:t>
+            </w:r>
+          </w:p>
+        </w:tc>
+        <w:tc>
+          <w:tcPr>
+            <w:tcW w:type="dxa" w:w="1200"/>
+          </w:tcPr>
+          <w:p>
+            <w:r>
+              <w:rPr>
+                <w:b/>
+                <w:color w:val="1F8A8C"/>
+                <w:sz w:val="18"/>
+              </w:rPr>
+              <w:t>Moyenne</w:t>
+            </w:r>
+          </w:p>
+        </w:tc>
+      </w:tr>
+      <w:tr>
+        <w:tc>
+          <w:tcPr>
+            <w:tcW w:type="dxa" w:w="1000"/>
+          </w:tcPr>
+          <w:p>
+            <w:r>
+              <w:rPr>
+                <w:b/>
+                <w:color w:val="1F8A8C"/>
+                <w:sz w:val="18"/>
+              </w:rPr>
+              <w:t>HBA-031</w:t>
+            </w:r>
+          </w:p>
+        </w:tc>
+        <w:tc>
+          <w:tcPr>
+            <w:tcW w:type="dxa" w:w="2400"/>
+          </w:tcPr>
+          <w:p>
+            <w:r>
+              <w:rPr>
+                <w:b/>
+                <w:color w:val="1F8A8C"/>
+                <w:sz w:val="18"/>
+              </w:rPr>
+              <w:t>Optimisation performance frontend</w:t>
+            </w:r>
+          </w:p>
+        </w:tc>
+        <w:tc>
+          <w:tcPr>
+            <w:tcW w:type="dxa" w:w="3200"/>
+          </w:tcPr>
+          <w:p>
+            <w:r>
+              <w:rPr>
+                <w:sz w:val="18"/>
+              </w:rPr>
+              <w:t>Réduction du temps de chargement global de l'application.</w:t>
+            </w:r>
+          </w:p>
+        </w:tc>
+        <w:tc>
+          <w:tcPr>
+            <w:tcW w:type="dxa" w:w="3600"/>
+          </w:tcPr>
+          <w:p>
+            <w:pPr>
+              <w:pStyle w:val="ListParagraph"/>
+              <w:numPr>
+                <w:ilvl w:val="0"/>
+                <w:numId w:val="3"/>
+              </w:numPr>
+              <w:spacing w:after="20"/>
+            </w:pPr>
+            <w:r>
+              <w:rPr>
+                <w:sz w:val="17"/>
+              </w:rPr>
+              <w:t>Le bundle initial chargé sur la page d'accueil reste sous un seuil raisonnable (à valider en fonction des mesures Lighthouse de HBA-028)</w:t>
+            </w:r>
+          </w:p>
+        </w:tc>
+        <w:tc>
+          <w:tcPr>
+            <w:tcW w:type="dxa" w:w="1200"/>
+          </w:tcPr>
+          <w:p>
+            <w:r>
+              <w:rPr>
+                <w:b/>
+                <w:color w:val="1F8A8C"/>
+                <w:sz w:val="18"/>
+              </w:rPr>
+              <w:t>Basse</w:t>
+            </w:r>
+          </w:p>
+        </w:tc>
+      </w:tr>
+    </w:tbl>
     <w:p>
       <w:pPr>
         <w:pStyle w:val="Heading1"/>

</xml_diff>